<commit_message>
docs(reports): reflect removal of OY-CIE header link and fit download button in header
Update system-method wording and research report section 10.0 now that the
OY-CIE research page link is gone (main 45d6831), retake the header figure,
and use the short '연구보고서' label so the button stays on the header row.

Co-Authored-By: Claude Opus 5.5 (1M context) <noreply@anthropic.com>
Claude-Session: https://claude.ai/code/session_01LQdjFC9fnMrr9xSyyZtwZF
</commit_message>
<xml_diff>
--- a/docs/reports/oy-rals-research-report-rev-20261026.docx
+++ b/docs/reports/oy-rals-research-report-rev-20261026.docx
@@ -84,7 +84,7 @@
           <w:i w:val="0"/>
           <w:lang w:val="ko-KR" w:eastAsia="ko-KR"/>
         </w:rPr>
-        <w:t xml:space="preserve">적용 기준: 운영 CORE 25문항·100점 · 2026.10.26 GitHub 공개 소스(main 4c02ca1) 재확인 · 화면 개편 반영</w:t>
+        <w:t xml:space="preserve">적용 기준: 운영 CORE 25문항·100점 · 2026.10.26 GitHub 공개 소스(main 45d6831) 재확인 · 화면 개편 반영</w:t>
       </w:r>
     </w:p>
     <w:p>
@@ -6659,7 +6659,7 @@
           <w:i w:val="0"/>
           <w:lang w:val="ko-KR" w:eastAsia="ko-KR"/>
         </w:rPr>
-        <w:t xml:space="preserve">주. 오른쪽 위 “연구보고서 다운로드”에서 본 보고서와 부속 자료를 받을 수 있다. 화면의 응답은 개발용 가상 응답이다.</w:t>
+        <w:t xml:space="preserve">주. 오른쪽 위 “연구보고서”에서 본 보고서와 부속 자료를 받을 수 있다. 화면의 응답은 개발용 가상 응답이다.</w:t>
       </w:r>
     </w:p>
     <w:p>
@@ -17384,7 +17384,7 @@
           <w:i w:val="0"/>
           <w:lang w:val="ko-KR" w:eastAsia="ko-KR"/>
         </w:rPr>
-        <w:t xml:space="preserve">개편 전 04 단계에 있던 규칙·검색형 대화 엔진(OY-CIE)은 질문 의도를 분류한 뒤 사례자료를 고정된 구조로 정리하는 방식이어서 질문별 답의 차별성이 제한적이라는 내부 점검 결과가 있었고, 메인 흐름에서 내려 별도 연구 작업실로만 남겼다. 어느 방식이든 외부 AI의 답변은 공식 점수·안전판정을 바꾸지 않으며, 실무자 검토 전 참고자료로만 다룬다.</w:t>
+        <w:t xml:space="preserve">개편 전 04 단계에 있던 규칙·검색형 대화 엔진(OY-CIE)은 질문 의도를 분류한 뒤 사례자료를 고정된 구조로 정리하는 방식이어서 질문별 답의 차별성이 제한적이라는 내부 점검 결과가 있었고, 메인 흐름과 머리글 링크에서 모두 내려 연구용 페이지 파일로만 보존하였다(main 45d6831). 어느 방식이든 외부 AI의 답변은 공식 점수·안전판정을 바꾸지 않으며, 실무자 검토 전 참고자료로만 다룬다.</w:t>
       </w:r>
     </w:p>
     <w:p>
@@ -22118,7 +22118,7 @@
           <w:i w:val="0"/>
           <w:lang w:val="ko-KR" w:eastAsia="ko-KR"/>
         </w:rPr>
-        <w:t xml:space="preserve">• 기준 소스를 main 4c02ca1로 다시 확인하고 화면 명칭을 현재 메뉴(01 선별평가·결과해석 ~ 05 사례기록·모니터링, 결과 탭 ①~③)에 맞추었다.</w:t>
+        <w:t xml:space="preserve">• 기준 소스를 main 45d6831로 다시 확인하고 화면 명칭을 현재 메뉴(01 선별평가·결과해석 ~ 05 사례기록·모니터링, 결과 탭 ①~③)에 맞추었다.</w:t>
       </w:r>
     </w:p>
     <w:p>

</xml_diff>

<commit_message>
fix(youth-risk): keep unknown safety items at direct support checked today
A safety item left as unknown (e.g. item 7 미상) still produced the
monitor level and an 'this week' first action, while CORE already flags
the safety check as incomplete. It now starts at brief individual support
with a same-day check, the same floor a 1-point safety item gets. Adds a
regression check and refreshes the report text and case H display line.

Co-Authored-By: Claude Opus 5.5 (1M context) <noreply@anthropic.com>
Claude-Session: https://claude.ai/code/session_01LQdjFC9fnMrr9xSyyZtwZF
</commit_message>
<xml_diff>
--- a/docs/reports/oy-rals-research-report-rev-20261026.docx
+++ b/docs/reports/oy-rals-research-report-rev-20261026.docx
@@ -5940,7 +5940,7 @@
           <w:i w:val="0"/>
           <w:lang w:val="ko-KR" w:eastAsia="ko-KR"/>
         </w:rPr>
-        <w:t xml:space="preserve">같은 응답에서 세 표시가 서로 다른 이름으로 나올 수 있다. 예컨대 6·9·19번이 각 3점인 가상 응답에서 CORE는 3단계(다기관 집중지원 필요성 검토), SUPPORT-5는 제4단계(고위기개입), 개입 수준은 “집중 사례관리(다기관)”로 표시되었다(운영 코드 재실행, 2026.10.26). 개정판 작성 중 확인된 불일치 하나는 해결되었다. 7번만 1점인 가상 응답에서 CORE는 안전 확인 대상(urgent)으로 분류했지만 개입 수준은 “관찰·예방”, 첫 행동은 “이번 주 안” 안전면담으로 표시되었다. 이후 안전문항이 양성이면 개입 수준을 최소 “단기 개별지원”으로 두고, 추가확인이 끝나지 않은 응답은 확인을 마칠 때까지 “집중 사례관리(다기관)”로 운영하며, 두 경우 모두 첫 행동을 “오늘 안”의 직접 확인으로 제시하도록 수정되었다(main 963f0d7, 코드 재실행으로 확인). 다만 세 표시의 이름과 경계값 전반의 정합성은 여전히 전문가 검토가 필요한 연구과제로 남긴다.</w:t>
+        <w:t xml:space="preserve">같은 응답에서 세 표시가 서로 다른 이름으로 나올 수 있다. 예컨대 6·9·19번이 각 3점인 가상 응답에서 CORE는 3단계(다기관 집중지원 필요성 검토), SUPPORT-5는 제4단계(고위기개입), 개입 수준은 “집중 사례관리(다기관)”로 표시되었다(운영 코드 재실행, 2026.10.26). 개정판 작성 중 확인된 불일치 하나는 해결되었다. 7번만 1점인 가상 응답에서 CORE는 안전 확인 대상(urgent)으로 분류했지만 개입 수준은 “관찰·예방”, 첫 행동은 “이번 주 안” 안전면담으로 표시되었다. 이후 안전문항이 양성이면 개입 수준을 최소 “단기 개별지원”으로 두고, 추가확인이 끝나지 않은 응답은 확인을 마칠 때까지 “집중 사례관리(다기관)”로 운영하며, 두 경우 모두 첫 행동을 “오늘 안”의 직접 확인으로 제시하도록 수정되었다(main 963f0d7). 같은 기준에 따라 안전문항이 미상인 응답도 최소 “단기 개별지원”과 오늘 안의 직접 확인으로 표시하도록 맞추었다(코드 재실행으로 확인). 다만 세 표시의 이름과 경계값 전반의 정합성은 여전히 전문가 검토가 필요한 연구과제로 남긴다.</w:t>
       </w:r>
     </w:p>
     <w:p>
@@ -20662,7 +20662,7 @@
           <w:i w:val="0"/>
           <w:lang w:val="ko-KR" w:eastAsia="ko-KR"/>
         </w:rPr>
-        <w:t xml:space="preserve">해석지 표시(2026.10.26 코드 재실행): 개입 수준 관찰·예방 · 요약 확인된 응답 기준 관찰·예방 수준 · 전체 판정 보류 · 안전 확인 미완료. 첫 행동: 이번 주 안에 자해·죽음 관련 안전 신호의 현재 상황을 직접 안전 면담으로 확인합니다.</w:t>
+        <w:t xml:space="preserve">해석지 표시(2026.10.26 코드 재실행): 개입 수준 단기 개별지원 · 요약 확인된 응답 기준 관찰·예방 수준 · 전체 판정 보류 · 안전 확인 미완료. 첫 행동: 오늘 안에 자해·죽음 관련 안전 신호의 현재 상황을 직접 안전 면담으로 확인합니다.</w:t>
       </w:r>
     </w:p>
     <w:p>
@@ -22230,7 +22230,7 @@
           <w:i w:val="0"/>
           <w:lang w:val="ko-KR" w:eastAsia="ko-KR"/>
         </w:rPr>
-        <w:t xml:space="preserve">• 5.3의 7번 문항 불일치를 해결됨으로 고치고, 안전 수정(main 963f0d7) 후의 코드 재실행 값으로 13장 사례 D·E의 표시값을 갱신하였다.</w:t>
+        <w:t xml:space="preserve">• 5.3의 7번 문항 불일치를 해결됨으로 고치고, 안전 수정(main 963f0d7) 후의 코드 재실행 값으로 13장 사례 D·E·H의 표시값을 갱신하였다. 안전문항 미상 응답의 개입 수준 하한도 같은 기준으로 맞추었다.</w:t>
       </w:r>
     </w:p>
     <w:p>

</xml_diff>